<commit_message>
Make Frayer Model poster landscape for better A4 print use
</commit_message>
<xml_diff>
--- a/resources/literacy-strategy-posters/Poster - Frayer Model.docx
+++ b/resources/literacy-strategy-posters/Poster - Frayer Model.docx
@@ -13,15 +13,15 @@
           <w:b/>
           <w:bCs/>
           <w:color w:val="0F766E"/>
-          <w:sz w:val="64"/>
-          <w:szCs w:val="64"/>
+          <w:sz w:val="44"/>
+          <w:szCs w:val="44"/>
         </w:rPr>
         <w:t xml:space="preserve">Frayer Model</w:t>
       </w:r>
     </w:p>
     <w:p>
       <w:pPr>
-        <w:spacing w:after="500"/>
+        <w:spacing w:after="120"/>
         <w:jc w:val="center"/>
       </w:pPr>
       <w:r>
@@ -53,20 +53,24 @@
         <w:gridCol w:w="100"/>
       </w:tblGrid>
       <w:tr>
+        <w:trPr>
+          <w:trHeight w:val="2100" w:hRule="atLeast"/>
+        </w:trPr>
         <w:tc>
           <w:tcPr>
             <w:tcW w:type="pct" w:w="50%"/>
             <w:shd w:fill="CCFBF1" w:color="auto" w:val="clear"/>
             <w:tcMar>
-              <w:top w:type="dxa" w:w="300"/>
+              <w:top w:type="dxa" w:w="150"/>
               <w:left w:type="dxa" w:w="300"/>
-              <w:bottom w:type="dxa" w:w="300"/>
+              <w:bottom w:type="dxa" w:w="150"/>
               <w:right w:type="dxa" w:w="300"/>
             </w:tcMar>
+            <w:vAlign w:val="center"/>
           </w:tcPr>
           <w:p>
             <w:pPr>
-              <w:spacing w:after="150"/>
+              <w:spacing w:after="60"/>
             </w:pPr>
             <w:r>
               <w:rPr>
@@ -74,8 +78,8 @@
                 <w:b/>
                 <w:bCs/>
                 <w:color w:val="0F766E"/>
-                <w:sz w:val="30"/>
-                <w:szCs w:val="30"/>
+                <w:sz w:val="26"/>
+                <w:szCs w:val="26"/>
               </w:rPr>
               <w:t xml:space="preserve">DEFINITION</w:t>
             </w:r>
@@ -86,8 +90,8 @@
                 <w:rFonts w:ascii="Times New Roman" w:cs="Times New Roman" w:eastAsia="Times New Roman" w:hAnsi="Times New Roman"/>
                 <w:i/>
                 <w:iCs/>
-                <w:sz w:val="22"/>
-                <w:szCs w:val="22"/>
+                <w:sz w:val="20"/>
+                <w:szCs w:val="20"/>
               </w:rPr>
               <w:t xml:space="preserve">In your own words — what does it mean?</w:t>
             </w:r>
@@ -98,15 +102,16 @@
             <w:tcW w:type="pct" w:w="50%"/>
             <w:shd w:fill="E2E8F0" w:color="auto" w:val="clear"/>
             <w:tcMar>
-              <w:top w:type="dxa" w:w="300"/>
+              <w:top w:type="dxa" w:w="150"/>
               <w:left w:type="dxa" w:w="300"/>
-              <w:bottom w:type="dxa" w:w="300"/>
+              <w:bottom w:type="dxa" w:w="150"/>
               <w:right w:type="dxa" w:w="300"/>
             </w:tcMar>
+            <w:vAlign w:val="center"/>
           </w:tcPr>
           <w:p>
             <w:pPr>
-              <w:spacing w:after="150"/>
+              <w:spacing w:after="60"/>
             </w:pPr>
             <w:r>
               <w:rPr>
@@ -114,8 +119,8 @@
                 <w:b/>
                 <w:bCs/>
                 <w:color w:val="14213D"/>
-                <w:sz w:val="30"/>
-                <w:szCs w:val="30"/>
+                <w:sz w:val="26"/>
+                <w:szCs w:val="26"/>
               </w:rPr>
               <w:t xml:space="preserve">CHARACTERISTICS</w:t>
             </w:r>
@@ -126,8 +131,8 @@
                 <w:rFonts w:ascii="Times New Roman" w:cs="Times New Roman" w:eastAsia="Times New Roman" w:hAnsi="Times New Roman"/>
                 <w:i/>
                 <w:iCs/>
-                <w:sz w:val="22"/>
-                <w:szCs w:val="22"/>
+                <w:sz w:val="20"/>
+                <w:szCs w:val="20"/>
               </w:rPr>
               <w:t xml:space="preserve">What are its key features or facts?</w:t>
             </w:r>
@@ -135,14 +140,18 @@
         </w:tc>
       </w:tr>
       <w:tr>
+        <w:trPr>
+          <w:trHeight w:val="750" w:hRule="atLeast"/>
+        </w:trPr>
         <w:tc>
           <w:tcPr>
             <w:gridSpan w:val="2"/>
             <w:shd w:fill="FFFFFF" w:color="auto" w:val="clear"/>
             <w:tcMar>
-              <w:top w:type="dxa" w:w="400"/>
-              <w:bottom w:type="dxa" w:w="400"/>
+              <w:top w:type="dxa" w:w="80"/>
+              <w:bottom w:type="dxa" w:w="80"/>
             </w:tcMar>
+            <w:vAlign w:val="center"/>
           </w:tcPr>
           <w:p>
             <w:pPr>
@@ -154,8 +163,8 @@
                 <w:b/>
                 <w:bCs/>
                 <w:color w:val="14213D"/>
-                <w:sz w:val="48"/>
-                <w:szCs w:val="48"/>
+                <w:sz w:val="40"/>
+                <w:szCs w:val="40"/>
               </w:rPr>
               <w:t xml:space="preserve">[ WORD ]</w:t>
             </w:r>
@@ -163,20 +172,24 @@
         </w:tc>
       </w:tr>
       <w:tr>
+        <w:trPr>
+          <w:trHeight w:val="2100" w:hRule="atLeast"/>
+        </w:trPr>
         <w:tc>
           <w:tcPr>
             <w:tcW w:type="pct" w:w="50%"/>
             <w:shd w:fill="FEF3C7" w:color="auto" w:val="clear"/>
             <w:tcMar>
-              <w:top w:type="dxa" w:w="300"/>
+              <w:top w:type="dxa" w:w="150"/>
               <w:left w:type="dxa" w:w="300"/>
-              <w:bottom w:type="dxa" w:w="300"/>
+              <w:bottom w:type="dxa" w:w="150"/>
               <w:right w:type="dxa" w:w="300"/>
             </w:tcMar>
+            <w:vAlign w:val="center"/>
           </w:tcPr>
           <w:p>
             <w:pPr>
-              <w:spacing w:after="150"/>
+              <w:spacing w:after="60"/>
             </w:pPr>
             <w:r>
               <w:rPr>
@@ -184,8 +197,8 @@
                 <w:b/>
                 <w:bCs/>
                 <w:color w:val="B45309"/>
-                <w:sz w:val="30"/>
-                <w:szCs w:val="30"/>
+                <w:sz w:val="26"/>
+                <w:szCs w:val="26"/>
               </w:rPr>
               <w:t xml:space="preserve">EXAMPLES</w:t>
             </w:r>
@@ -196,8 +209,8 @@
                 <w:rFonts w:ascii="Times New Roman" w:cs="Times New Roman" w:eastAsia="Times New Roman" w:hAnsi="Times New Roman"/>
                 <w:i/>
                 <w:iCs/>
-                <w:sz w:val="22"/>
-                <w:szCs w:val="22"/>
+                <w:sz w:val="20"/>
+                <w:szCs w:val="20"/>
               </w:rPr>
               <w:t xml:space="preserve">Real examples that show this idea.</w:t>
             </w:r>
@@ -208,15 +221,16 @@
             <w:tcW w:type="pct" w:w="50%"/>
             <w:shd w:fill="FEE2E2" w:color="auto" w:val="clear"/>
             <w:tcMar>
-              <w:top w:type="dxa" w:w="300"/>
+              <w:top w:type="dxa" w:w="150"/>
               <w:left w:type="dxa" w:w="300"/>
-              <w:bottom w:type="dxa" w:w="300"/>
+              <w:bottom w:type="dxa" w:w="150"/>
               <w:right w:type="dxa" w:w="300"/>
             </w:tcMar>
+            <w:vAlign w:val="center"/>
           </w:tcPr>
           <w:p>
             <w:pPr>
-              <w:spacing w:after="150"/>
+              <w:spacing w:after="60"/>
             </w:pPr>
             <w:r>
               <w:rPr>
@@ -224,8 +238,8 @@
                 <w:b/>
                 <w:bCs/>
                 <w:color w:val="B91C1C"/>
-                <w:sz w:val="30"/>
-                <w:szCs w:val="30"/>
+                <w:sz w:val="26"/>
+                <w:szCs w:val="26"/>
               </w:rPr>
               <w:t xml:space="preserve">NON-EXAMPLES</w:t>
             </w:r>
@@ -236,8 +250,8 @@
                 <w:rFonts w:ascii="Times New Roman" w:cs="Times New Roman" w:eastAsia="Times New Roman" w:hAnsi="Times New Roman"/>
                 <w:i/>
                 <w:iCs/>
-                <w:sz w:val="22"/>
-                <w:szCs w:val="22"/>
+                <w:sz w:val="20"/>
+                <w:szCs w:val="20"/>
               </w:rPr>
               <w:t xml:space="preserve">Things that are NOT this idea.</w:t>
             </w:r>
@@ -247,7 +261,7 @@
     </w:tbl>
     <w:p>
       <w:pPr>
-        <w:spacing w:before="400"/>
+        <w:spacing w:before="150"/>
         <w:jc w:val="center"/>
       </w:pPr>
       <w:r>
@@ -263,7 +277,7 @@
       </w:r>
     </w:p>
     <w:sectPr>
-      <w:pgSz w:w="11906" w:h="16838" w:orient="portrait"/>
+      <w:pgSz w:w="16838" w:h="11906" w:orient="landscape"/>
       <w:pgMar w:top="1440" w:right="1440" w:bottom="1440" w:left="1440" w:header="708" w:footer="708" w:gutter="0"/>
       <w:pgNumType/>
       <w:docGrid w:linePitch="360"/>

</xml_diff>